<commit_message>
docs(legal): simplify partner contract downloads and templates
</commit_message>
<xml_diff>
--- a/public/downloads/partner-program/vendor-partner-offer-template.docx
+++ b/public/downloads/partner-program/vendor-partner-offer-template.docx
@@ -54,7 +54,7 @@
         <w:t>карте покрытия и чек-листе</w:t>
       </w:r>
       <w:r>
-        <w:t>. Текущая версия — 0.3.</w:t>
+        <w:t>.</w:t>
       </w:r>
     </w:p>
     <w:p>
@@ -62,7 +62,7 @@
         <w:spacing w:after="100" w:line="247" w:lineRule="auto"/>
       </w:pPr>
       <w:r>
-        <w:t>Шаблон предназначен для оферт компаний с расчётами через RevRoute. Он не заменяет действующие документы автоматически; переход на новую редакцию оформляется отдельно.</w:t>
+        <w:t>Расчёты по шаблону проводятся через RevRoute. Переход действующих договоров на новую редакцию оформляется отдельно.</w:t>
       </w:r>
     </w:p>
     <w:p>
@@ -78,7 +78,7 @@
         <w:spacing w:after="100" w:line="247" w:lineRule="auto"/>
       </w:pPr>
       <w:r>
-        <w:t xml:space="preserve">Перед выпуском удалите эту инструкцию, редакторские подсказки в цитатах, редакторское приложение, историю подготовки и невыбранные альтернативы. Форму подтверждения используйте отдельно в процессе заключения. Заполните все </w:t>
+        <w:t xml:space="preserve">Перед выпуском удалите эту инструкцию, редакторские подсказки в цитатах, редакторское приложение и невыбранные альтернативы. Форму подтверждения используйте отдельно в процессе заключения. Заполните все </w:t>
       </w:r>
       <w:r>
         <w:t>[[TBD: …]]</w:t>
@@ -4153,49 +4153,6 @@
         <w:spacing w:after="20"/>
       </w:pPr>
     </w:p>
-    <w:p>
-      <w:pPr>
-        <w:pStyle w:val="Heading1"/>
-      </w:pPr>
-      <w:r>
-        <w:t>История подготовки</w:t>
-      </w:r>
-    </w:p>
-    <w:p>
-      <w:pPr>
-        <w:pStyle w:val="ListBullet"/>
-      </w:pPr>
-      <w:r>
-        <w:t>12.10.2026 — версия 0.3: после проверки внешнего аудита уточнены раздельные подтверждения, цели и основания ПДн, содержание поручения, контроль чеков, самостоятельность партнёра и фиксация рекламных действий. Базовая нетто-модель сохранена.</w:t>
-      </w:r>
-    </w:p>
-    <w:p>
-      <w:pPr>
-        <w:pStyle w:val="ListBullet"/>
-      </w:pPr>
-      <w:r>
-        <w:t>12.10.2026 — после комментариев владельца унифицированы услуга, НПД/ИП/организации, нетто-модель и расчёты через номинальный счёт. Выбран один базовый акцепт с отдельным допуском; конкретизированы два получателя. Подключение и контрольная выплата подтверждаются при запуске каждой программы.</w:t>
-      </w:r>
-    </w:p>
-    <w:p>
-      <w:pPr>
-        <w:pStyle w:val="ListBullet"/>
-      </w:pPr>
-      <w:r>
-        <w:t xml:space="preserve">12.10.2026 — подготовлен универсальный проект из правил статьи и материалов оценки программ. Из </w:t>
-      </w:r>
-      <w:r>
-        <w:t>референса TenChat</w:t>
-      </w:r>
-      <w:r>
-        <w:t xml:space="preserve"> использованы отдельное подтверждение присоединения, последовательность приёмки и оплаты, раздельные основания нескольких получателей и корректировки. Чужие ставки, сроки и ограничения статусов не переносились.</w:t>
-      </w:r>
-    </w:p>
-    <w:p>
-      <w:r>
-        <w:t>Рабочий черновик. Версия указана в метаданных документа. Документ не является действующей публичной офертой до утверждения и публикации. Перед публикацией требуется вычитка практикующим юристом по праву РФ и налоговым консультантом.</w:t>
-      </w:r>
-    </w:p>
     <w:sectPr>
       <w:headerReference w:type="default" r:id="rId9"/>
       <w:footerReference w:type="default" r:id="rId10"/>

</xml_diff>